<commit_message>
mejoras en compraventas iva del trimestre
</commit_message>
<xml_diff>
--- a/MANUAL DE COMO CONECTAR VSCODE CON XAMPP.docx
+++ b/MANUAL DE COMO CONECTAR VSCODE CON XAMPP.docx
@@ -22,7 +22,15 @@
           <w:b/>
           <w:bCs/>
         </w:rPr>
-        <w:t xml:space="preserve">servir web PHP en </w:t>
+        <w:t xml:space="preserve">servir web PHP </w:t>
+      </w:r>
+      <w:proofErr w:type="gramStart"/>
+      <w:r>
+        <w:rPr>
+          <w:b/>
+          <w:bCs/>
+        </w:rPr>
+        <w:t xml:space="preserve">en </w:t>
       </w:r>
       <w:r>
         <w:rPr>
@@ -36,7 +44,15 @@
           <w:b/>
           <w:bCs/>
         </w:rPr>
-        <w:t xml:space="preserve">isual </w:t>
+        <w:t>isual</w:t>
+      </w:r>
+      <w:proofErr w:type="gramEnd"/>
+      <w:r>
+        <w:rPr>
+          <w:b/>
+          <w:bCs/>
+        </w:rPr>
+        <w:t xml:space="preserve"> </w:t>
       </w:r>
       <w:r>
         <w:rPr>
@@ -98,8 +114,13 @@
         <w:t xml:space="preserve"> </w:t>
       </w:r>
       <w:r>
-        <w:t>gracias a la extensión PHP server</w:t>
-      </w:r>
+        <w:t xml:space="preserve">gracias a la extensión PHP </w:t>
+      </w:r>
+      <w:proofErr w:type="gramStart"/>
+      <w:r>
+        <w:t>server</w:t>
+      </w:r>
+      <w:proofErr w:type="gramEnd"/>
       <w:r>
         <w:t xml:space="preserve">. </w:t>
       </w:r>
@@ -110,10 +131,26 @@
         <w:t xml:space="preserve"> </w:t>
       </w:r>
       <w:r>
-        <w:t xml:space="preserve">Todo esto que sigue funciona gracias a PHP server, y puedo parar XAMPP y sigue funcionando, de XAMP lo único que usa es el php.exe </w:t>
-      </w:r>
-      <w:r>
-        <w:t>porque la extensión PHP server no lleva php.exe</w:t>
+        <w:t xml:space="preserve">Todo esto que sigue funciona gracias a PHP </w:t>
+      </w:r>
+      <w:proofErr w:type="gramStart"/>
+      <w:r>
+        <w:t>server</w:t>
+      </w:r>
+      <w:proofErr w:type="gramEnd"/>
+      <w:r>
+        <w:t xml:space="preserve">, y puedo parar XAMPP y sigue funcionando, de XAMP lo único que usa es el php.exe </w:t>
+      </w:r>
+      <w:r>
+        <w:t xml:space="preserve">porque la extensión PHP </w:t>
+      </w:r>
+      <w:proofErr w:type="gramStart"/>
+      <w:r>
+        <w:t>server</w:t>
+      </w:r>
+      <w:proofErr w:type="gramEnd"/>
+      <w:r>
+        <w:t xml:space="preserve"> no lleva php.exe</w:t>
       </w:r>
       <w:r>
         <w:t>.</w:t>
@@ -186,16 +223,26 @@
         <w:t xml:space="preserve"> </w:t>
       </w:r>
       <w:r>
-        <w:t xml:space="preserve">(una de ellas PHP server) </w:t>
+        <w:t xml:space="preserve">(una de ellas PHP </w:t>
+      </w:r>
+      <w:proofErr w:type="gramStart"/>
+      <w:r>
+        <w:t>server</w:t>
+      </w:r>
+      <w:proofErr w:type="gramEnd"/>
+      <w:r>
+        <w:t xml:space="preserve">) </w:t>
       </w:r>
       <w:r>
         <w:t xml:space="preserve">para VSC y otras 3 de </w:t>
       </w:r>
       <w:proofErr w:type="spellStart"/>
+      <w:proofErr w:type="gramStart"/>
       <w:r>
         <w:t>mysql</w:t>
       </w:r>
       <w:proofErr w:type="spellEnd"/>
+      <w:proofErr w:type="gramEnd"/>
       <w:r>
         <w:t xml:space="preserve"> pero creo que las de </w:t>
       </w:r>
@@ -243,7 +290,15 @@
       </w:r>
       <w:proofErr w:type="spellEnd"/>
       <w:r>
-        <w:t xml:space="preserve"> server </w:t>
+        <w:t xml:space="preserve"> </w:t>
+      </w:r>
+      <w:proofErr w:type="gramStart"/>
+      <w:r>
+        <w:t>server</w:t>
+      </w:r>
+      <w:proofErr w:type="gramEnd"/>
+      <w:r>
+        <w:t xml:space="preserve"> </w:t>
       </w:r>
       <w:proofErr w:type="spellStart"/>
       <w:r>
@@ -298,7 +353,15 @@
         <w:t xml:space="preserve">OJO: </w:t>
       </w:r>
       <w:r>
-        <w:t xml:space="preserve">PHP server no lleva </w:t>
+        <w:t xml:space="preserve">PHP </w:t>
+      </w:r>
+      <w:proofErr w:type="gramStart"/>
+      <w:r>
+        <w:t>server</w:t>
+      </w:r>
+      <w:proofErr w:type="gramEnd"/>
+      <w:r>
+        <w:t xml:space="preserve"> no lleva </w:t>
       </w:r>
       <w:proofErr w:type="spellStart"/>
       <w:r>
@@ -388,7 +451,15 @@
       </w:r>
       <w:proofErr w:type="spellEnd"/>
       <w:r>
-        <w:t xml:space="preserve"> server </w:t>
+        <w:t xml:space="preserve"> </w:t>
+      </w:r>
+      <w:proofErr w:type="gramStart"/>
+      <w:r>
+        <w:t>server</w:t>
+      </w:r>
+      <w:proofErr w:type="gramEnd"/>
+      <w:r>
+        <w:t xml:space="preserve"> </w:t>
       </w:r>
       <w:r>
         <w:t>configuración</w:t>
@@ -445,8 +516,13 @@
         <w:t xml:space="preserve"> de VSC </w:t>
       </w:r>
       <w:r>
-        <w:t>PHP server</w:t>
-      </w:r>
+        <w:t xml:space="preserve">PHP </w:t>
+      </w:r>
+      <w:proofErr w:type="gramStart"/>
+      <w:r>
+        <w:t>server</w:t>
+      </w:r>
+      <w:proofErr w:type="gramEnd"/>
       <w:r>
         <w:t>,</w:t>
       </w:r>
@@ -475,13 +551,26 @@
         <w:t>crea</w:t>
       </w:r>
       <w:r>
-        <w:t xml:space="preserve"> PHP server</w:t>
-      </w:r>
+        <w:t xml:space="preserve"> PHP </w:t>
+      </w:r>
+      <w:proofErr w:type="gramStart"/>
+      <w:r>
+        <w:t>server</w:t>
+      </w:r>
+      <w:proofErr w:type="gramEnd"/>
       <w:r>
         <w:t xml:space="preserve"> con el php.exe</w:t>
       </w:r>
       <w:r>
-        <w:t xml:space="preserve">. Pero ese PHP server usa el php.exe que tiene X en su carpeta de instalación, que es para lo único que se necesita </w:t>
+        <w:t xml:space="preserve">. Pero ese PHP </w:t>
+      </w:r>
+      <w:proofErr w:type="gramStart"/>
+      <w:r>
+        <w:t>server</w:t>
+      </w:r>
+      <w:proofErr w:type="gramEnd"/>
+      <w:r>
+        <w:t xml:space="preserve"> usa el php.exe que tiene X en su carpeta de instalación, que es para lo único que se necesita </w:t>
       </w:r>
       <w:proofErr w:type="spellStart"/>
       <w:r>
@@ -497,7 +586,15 @@
     </w:p>
     <w:p>
       <w:r>
-        <w:t xml:space="preserve">Pero VSC usa la folder que tiene abierta para poder mapear el </w:t>
+        <w:t xml:space="preserve">Pero VSC usa </w:t>
+      </w:r>
+      <w:proofErr w:type="gramStart"/>
+      <w:r>
+        <w:t>la folder</w:t>
+      </w:r>
+      <w:proofErr w:type="gramEnd"/>
+      <w:r>
+        <w:t xml:space="preserve"> que tiene abierta para poder mapear el </w:t>
       </w:r>
       <w:proofErr w:type="spellStart"/>
       <w:r>
@@ -505,7 +602,31 @@
       </w:r>
       <w:proofErr w:type="spellEnd"/>
       <w:r>
-        <w:t xml:space="preserve"> con el PHP server, es decir, si el folder de VSC no es el del script que se quiere ejecutar en el PHP server, no va a funcionar porque no se ven, PHP server no encuentra el script para ejecutarlo y da error de no encontrado.</w:t>
+        <w:t xml:space="preserve"> con el PHP </w:t>
+      </w:r>
+      <w:proofErr w:type="gramStart"/>
+      <w:r>
+        <w:t>server</w:t>
+      </w:r>
+      <w:proofErr w:type="gramEnd"/>
+      <w:r>
+        <w:t xml:space="preserve">, es decir, si el folder de VSC no es el del script que se quiere ejecutar en el PHP </w:t>
+      </w:r>
+      <w:proofErr w:type="gramStart"/>
+      <w:r>
+        <w:t>server</w:t>
+      </w:r>
+      <w:proofErr w:type="gramEnd"/>
+      <w:r>
+        <w:t xml:space="preserve">, no va a funcionar porque no se ven, PHP </w:t>
+      </w:r>
+      <w:proofErr w:type="gramStart"/>
+      <w:r>
+        <w:t>server</w:t>
+      </w:r>
+      <w:proofErr w:type="gramEnd"/>
+      <w:r>
+        <w:t xml:space="preserve"> no encuentra el script para ejecutarlo y da error de no encontrado.</w:t>
       </w:r>
       <w:r>
         <w:t xml:space="preserve"> Los servidores siempre usan una carpera del pc local para poder comunicarse con el pc que es </w:t>
@@ -514,7 +635,15 @@
         <w:t>la carpeta</w:t>
       </w:r>
       <w:r>
-        <w:t xml:space="preserve"> que tiene los script, esa carpeta en este caso es Folder de VSC</w:t>
+        <w:t xml:space="preserve"> que tiene </w:t>
+      </w:r>
+      <w:proofErr w:type="gramStart"/>
+      <w:r>
+        <w:t>los script</w:t>
+      </w:r>
+      <w:proofErr w:type="gramEnd"/>
+      <w:r>
+        <w:t>, esa carpeta en este caso es Folder de VSC</w:t>
       </w:r>
       <w:r>
         <w:t>.</w:t>
@@ -530,21 +659,29 @@
       </w:r>
       <w:proofErr w:type="spellEnd"/>
       <w:r>
-        <w:t xml:space="preserve"> de VSC en la parte de extensión/PHP server es Relative </w:t>
-      </w:r>
-      <w:proofErr w:type="spellStart"/>
-      <w:r>
-        <w:t>Path</w:t>
-      </w:r>
-      <w:proofErr w:type="spellEnd"/>
-      <w:r>
-        <w:t xml:space="preserve">: con este </w:t>
+        <w:t xml:space="preserve"> de VSC en la parte de extensión/PHP </w:t>
+      </w:r>
+      <w:proofErr w:type="gramStart"/>
+      <w:r>
+        <w:t>server</w:t>
+      </w:r>
+      <w:proofErr w:type="gramEnd"/>
+      <w:r>
+        <w:t xml:space="preserve"> es Relative Path: con este </w:t>
       </w:r>
       <w:r>
         <w:t>parámetro</w:t>
       </w:r>
       <w:r>
-        <w:t xml:space="preserve"> se le indica una ruta local para mapear con el servidor PHP server, indicando una ruta, haríamos que </w:t>
+        <w:t xml:space="preserve"> se le indica una ruta local para mapear con el servidor PHP </w:t>
+      </w:r>
+      <w:proofErr w:type="gramStart"/>
+      <w:r>
+        <w:t>server</w:t>
+      </w:r>
+      <w:proofErr w:type="gramEnd"/>
+      <w:r>
+        <w:t xml:space="preserve">, indicando una ruta, haríamos que </w:t>
       </w:r>
       <w:proofErr w:type="spellStart"/>
       <w:r>
@@ -552,7 +689,15 @@
       </w:r>
       <w:proofErr w:type="spellEnd"/>
       <w:r>
-        <w:t xml:space="preserve"> server cargue script que no </w:t>
+        <w:t xml:space="preserve"> </w:t>
+      </w:r>
+      <w:proofErr w:type="gramStart"/>
+      <w:r>
+        <w:t>server</w:t>
+      </w:r>
+      <w:proofErr w:type="gramEnd"/>
+      <w:r>
+        <w:t xml:space="preserve"> cargue script que no </w:t>
       </w:r>
       <w:r>
         <w:t>esté</w:t>
@@ -561,7 +706,15 @@
         <w:t xml:space="preserve"> en el Folder actual.</w:t>
       </w:r>
       <w:r>
-        <w:t xml:space="preserve"> El servidor que crea PHP server ve los archivos de la carpeta donde el propio servidor est</w:t>
+        <w:t xml:space="preserve"> El servidor que crea PHP </w:t>
+      </w:r>
+      <w:proofErr w:type="gramStart"/>
+      <w:r>
+        <w:t>server</w:t>
+      </w:r>
+      <w:proofErr w:type="gramEnd"/>
+      <w:r>
+        <w:t xml:space="preserve"> ve los archivos de la carpeta donde el propio servidor est</w:t>
       </w:r>
       <w:r>
         <w:t>á</w:t>
@@ -642,14 +795,46 @@
           <w:b/>
           <w:bCs/>
         </w:rPr>
-        <w:t xml:space="preserve"> de PHP server de</w:t>
-      </w:r>
-      <w:r>
-        <w:rPr>
-          <w:b/>
-          <w:bCs/>
-        </w:rPr>
-        <w:t xml:space="preserve"> VSC primero debe estar abierta la folder del fichero a ejecutar en VSC. Ir File, </w:t>
+        <w:t xml:space="preserve"> de PHP </w:t>
+      </w:r>
+      <w:proofErr w:type="gramStart"/>
+      <w:r>
+        <w:rPr>
+          <w:b/>
+          <w:bCs/>
+        </w:rPr>
+        <w:t>server</w:t>
+      </w:r>
+      <w:proofErr w:type="gramEnd"/>
+      <w:r>
+        <w:rPr>
+          <w:b/>
+          <w:bCs/>
+        </w:rPr>
+        <w:t xml:space="preserve"> de</w:t>
+      </w:r>
+      <w:r>
+        <w:rPr>
+          <w:b/>
+          <w:bCs/>
+        </w:rPr>
+        <w:t xml:space="preserve"> VSC primero debe estar abierta </w:t>
+      </w:r>
+      <w:proofErr w:type="gramStart"/>
+      <w:r>
+        <w:rPr>
+          <w:b/>
+          <w:bCs/>
+        </w:rPr>
+        <w:t>la folder</w:t>
+      </w:r>
+      <w:proofErr w:type="gramEnd"/>
+      <w:r>
+        <w:rPr>
+          <w:b/>
+          <w:bCs/>
+        </w:rPr>
+        <w:t xml:space="preserve"> del fichero a ejecutar en VSC. Ir File, </w:t>
       </w:r>
       <w:proofErr w:type="spellStart"/>
       <w:r>
@@ -711,8 +896,13 @@
         </w:rPr>
         <w:t xml:space="preserve">. y así ya se puede usar lo del PHP SERVER: </w:t>
       </w:r>
-      <w:r>
-        <w:t xml:space="preserve">server </w:t>
+      <w:proofErr w:type="gramStart"/>
+      <w:r>
+        <w:t>server</w:t>
+      </w:r>
+      <w:proofErr w:type="gramEnd"/>
+      <w:r>
+        <w:t xml:space="preserve"> </w:t>
       </w:r>
       <w:proofErr w:type="spellStart"/>
       <w:r>
@@ -753,7 +943,15 @@
       </w:r>
       <w:proofErr w:type="spellEnd"/>
       <w:r>
-        <w:t>, y el servidor de PHP del contenedor tiene mapeada la carpeta www, con lo que todo lo que se ponga en ella o dentro de subcarpetas lo carga en el contenedor y lo ve el servidor PHP. Pues no me funciona el PHP server de VSC, en localhost:3000/</w:t>
+        <w:t xml:space="preserve">, y el servidor de PHP del contenedor tiene mapeada la carpeta www, con lo que todo lo que se ponga en ella o dentro de subcarpetas lo carga en el contenedor y lo ve el servidor PHP. Pues no me funciona el PHP </w:t>
+      </w:r>
+      <w:proofErr w:type="gramStart"/>
+      <w:r>
+        <w:t>server</w:t>
+      </w:r>
+      <w:proofErr w:type="gramEnd"/>
+      <w:r>
+        <w:t xml:space="preserve"> de VSC, en localhost:3000/</w:t>
       </w:r>
       <w:proofErr w:type="spellStart"/>
       <w:r>
@@ -875,15 +1073,7 @@
         <w:t>Windows</w:t>
       </w:r>
       <w:r>
-        <w:t xml:space="preserve"> </w:t>
-      </w:r>
-      <w:proofErr w:type="spellStart"/>
-      <w:r>
-        <w:t>Path</w:t>
-      </w:r>
-      <w:proofErr w:type="spellEnd"/>
-      <w:r>
-        <w:t xml:space="preserve"> le pongo la línea c:\xampp\php, como le estoy indicando donde hay un php.exe bastaría con escribir </w:t>
+        <w:t xml:space="preserve"> Path le pongo la línea c:\xampp\php, como le estoy indicando donde hay un php.exe bastaría con escribir </w:t>
       </w:r>
       <w:proofErr w:type="spellStart"/>
       <w:r>
@@ -1064,7 +1254,23 @@
           <w:b/>
           <w:bCs/>
         </w:rPr>
-        <w:t>, SERVIDOR de VCS extensión PHP server. Puedo ver que</w:t>
+        <w:t xml:space="preserve">, SERVIDOR de VCS extensión PHP </w:t>
+      </w:r>
+      <w:proofErr w:type="gramStart"/>
+      <w:r>
+        <w:rPr>
+          <w:b/>
+          <w:bCs/>
+        </w:rPr>
+        <w:t>server</w:t>
+      </w:r>
+      <w:proofErr w:type="gramEnd"/>
+      <w:r>
+        <w:rPr>
+          <w:b/>
+          <w:bCs/>
+        </w:rPr>
+        <w:t>. Puedo ver que</w:t>
       </w:r>
       <w:r>
         <w:rPr>
@@ -1108,8 +1314,17 @@
           <w:b/>
           <w:bCs/>
         </w:rPr>
-        <w:t>-in HTTP server</w:t>
-      </w:r>
+        <w:t xml:space="preserve">-in HTTP </w:t>
+      </w:r>
+      <w:proofErr w:type="gramStart"/>
+      <w:r>
+        <w:rPr>
+          <w:b/>
+          <w:bCs/>
+        </w:rPr>
+        <w:t>server</w:t>
+      </w:r>
+      <w:proofErr w:type="gramEnd"/>
       <w:r>
         <w:rPr>
           <w:b/>
@@ -1620,10 +1835,22 @@
           <w:b/>
           <w:bCs/>
         </w:rPr>
-        <w:t xml:space="preserve"> -S localhost:8000</w:t>
-      </w:r>
-      <w:r>
-        <w:t xml:space="preserve">  esto crea un servidor de </w:t>
+        <w:t xml:space="preserve"> -S localhost:</w:t>
+      </w:r>
+      <w:proofErr w:type="gramStart"/>
+      <w:r>
+        <w:rPr>
+          <w:b/>
+          <w:bCs/>
+        </w:rPr>
+        <w:t>8000</w:t>
+      </w:r>
+      <w:r>
+        <w:t xml:space="preserve">  esto</w:t>
+      </w:r>
+      <w:proofErr w:type="gramEnd"/>
+      <w:r>
+        <w:t xml:space="preserve"> crea un servidor de </w:t>
       </w:r>
       <w:proofErr w:type="spellStart"/>
       <w:r>
@@ -1784,11 +2011,20 @@
           <w:b/>
           <w:bCs/>
         </w:rPr>
-        <w:t xml:space="preserve">Veo que el servidor que ha creado con el CMD  </w:t>
+        <w:t xml:space="preserve">Veo que el servidor que ha creado con el </w:t>
+      </w:r>
+      <w:proofErr w:type="gramStart"/>
+      <w:r>
+        <w:rPr>
+          <w:b/>
+          <w:bCs/>
+        </w:rPr>
+        <w:t xml:space="preserve">CMD  </w:t>
       </w:r>
       <w:r>
         <w:t>Es</w:t>
       </w:r>
+      <w:proofErr w:type="gramEnd"/>
       <w:r>
         <w:t xml:space="preserve"> de tipo </w:t>
       </w:r>
@@ -1798,8 +2034,21 @@
       </w:r>
       <w:proofErr w:type="spellEnd"/>
       <w:r>
-        <w:t>-in HTTP server igual que el de PHP server</w:t>
-      </w:r>
+        <w:t xml:space="preserve">-in HTTP </w:t>
+      </w:r>
+      <w:proofErr w:type="gramStart"/>
+      <w:r>
+        <w:t>server</w:t>
+      </w:r>
+      <w:proofErr w:type="gramEnd"/>
+      <w:r>
+        <w:t xml:space="preserve"> igual que el de PHP </w:t>
+      </w:r>
+      <w:proofErr w:type="gramStart"/>
+      <w:r>
+        <w:t>server</w:t>
+      </w:r>
+      <w:proofErr w:type="gramEnd"/>
       <w:r>
         <w:t xml:space="preserve">. Así que el problema no es </w:t>
       </w:r>
@@ -1809,8 +2058,21 @@
       </w:r>
       <w:proofErr w:type="spellEnd"/>
       <w:r>
-        <w:t xml:space="preserve"> server si no la configuración de algún parámetro de VSC o PHP server</w:t>
-      </w:r>
+        <w:t xml:space="preserve"> </w:t>
+      </w:r>
+      <w:proofErr w:type="gramStart"/>
+      <w:r>
+        <w:t>server</w:t>
+      </w:r>
+      <w:proofErr w:type="gramEnd"/>
+      <w:r>
+        <w:t xml:space="preserve"> si no la configuración de algún parámetro de VSC o PHP </w:t>
+      </w:r>
+      <w:proofErr w:type="gramStart"/>
+      <w:r>
+        <w:t>server</w:t>
+      </w:r>
+      <w:proofErr w:type="gramEnd"/>
       <w:r>
         <w:t>.</w:t>
       </w:r>
@@ -1901,17 +2163,8 @@
                 <w:b/>
                 <w:bCs/>
               </w:rPr>
-              <w:t xml:space="preserve"> </w:t>
-            </w:r>
-            <w:proofErr w:type="spellStart"/>
-            <w:r>
-              <w:rPr>
-                <w:b/>
-                <w:bCs/>
-              </w:rPr>
-              <w:t>Path</w:t>
-            </w:r>
-            <w:proofErr w:type="spellEnd"/>
+              <w:t xml:space="preserve"> Path</w:t>
+            </w:r>
             <w:r>
               <w:rPr>
                 <w:b/>
@@ -2735,7 +2988,15 @@
                 <w:b/>
                 <w:bCs/>
               </w:rPr>
-              <w:t xml:space="preserve"> ¿Qué pasa si luego creas un </w:t>
+              <w:t xml:space="preserve"> </w:t>
+            </w:r>
+            <w:proofErr w:type="gramStart"/>
+            <w:r>
+              <w:rPr>
+                <w:b/>
+                <w:bCs/>
+              </w:rPr>
+              <w:t xml:space="preserve">¿Qué pasa si luego creas un </w:t>
             </w:r>
             <w:proofErr w:type="spellStart"/>
             <w:r>
@@ -2743,7 +3004,15 @@
                 <w:b/>
                 <w:bCs/>
               </w:rPr>
-              <w:t>launch.json</w:t>
+              <w:t>launch.</w:t>
+            </w:r>
+            <w:proofErr w:type="gramEnd"/>
+            <w:r>
+              <w:rPr>
+                <w:b/>
+                <w:bCs/>
+              </w:rPr>
+              <w:t>json</w:t>
             </w:r>
             <w:proofErr w:type="spellEnd"/>
             <w:r>
@@ -2848,7 +3117,25 @@
                 <w:bCs/>
                 <w:u w:val="single"/>
               </w:rPr>
-              <w:t xml:space="preserve"> con XAMPP o contenedor debo primero abrir el folder correspondiente a donde ejecuta los script XAMPP </w:t>
+              <w:t xml:space="preserve"> con XAMPP o contenedor debo primero abrir el folder correspondiente a donde ejecuta </w:t>
+            </w:r>
+            <w:proofErr w:type="gramStart"/>
+            <w:r>
+              <w:rPr>
+                <w:b/>
+                <w:bCs/>
+                <w:u w:val="single"/>
+              </w:rPr>
+              <w:t>los script</w:t>
+            </w:r>
+            <w:proofErr w:type="gramEnd"/>
+            <w:r>
+              <w:rPr>
+                <w:b/>
+                <w:bCs/>
+                <w:u w:val="single"/>
+              </w:rPr>
+              <w:t xml:space="preserve"> XAMPP </w:t>
             </w:r>
             <w:r>
               <w:rPr>
@@ -2945,7 +3232,23 @@
                 <w:b/>
                 <w:bCs/>
               </w:rPr>
-              <w:t>Usando PHP server para ejecutar un script que est</w:t>
+              <w:t xml:space="preserve">Usando PHP </w:t>
+            </w:r>
+            <w:proofErr w:type="gramStart"/>
+            <w:r>
+              <w:rPr>
+                <w:b/>
+                <w:bCs/>
+              </w:rPr>
+              <w:t>server</w:t>
+            </w:r>
+            <w:proofErr w:type="gramEnd"/>
+            <w:r>
+              <w:rPr>
+                <w:b/>
+                <w:bCs/>
+              </w:rPr>
+              <w:t xml:space="preserve"> para ejecutar un script que est</w:t>
             </w:r>
             <w:r>
               <w:rPr>
@@ -3132,6 +3435,18 @@
             </w:r>
           </w:p>
           <w:p>
+            <w:pPr>
+              <w:pStyle w:val="Prrafodelista"/>
+              <w:numPr>
+                <w:ilvl w:val="0"/>
+                <w:numId w:val="4"/>
+              </w:numPr>
+            </w:pPr>
+            <w:r>
+              <w:t>TENER xdebud.dll descargada y en el directorio correspondiente</w:t>
+            </w:r>
+          </w:p>
+          <w:p>
             <w:r>
               <w:t xml:space="preserve">PORQUE si se crea, aparece la opción listen to </w:t>
             </w:r>
@@ -3179,7 +3494,15 @@
               </w:rPr>
             </w:pPr>
             <w:r>
-              <w:t xml:space="preserve">Pero PHP server crea un servidor tipo </w:t>
+              <w:t xml:space="preserve">Pero PHP </w:t>
+            </w:r>
+            <w:proofErr w:type="gramStart"/>
+            <w:r>
+              <w:t>server</w:t>
+            </w:r>
+            <w:proofErr w:type="gramEnd"/>
+            <w:r>
+              <w:t xml:space="preserve"> crea un servidor tipo </w:t>
             </w:r>
             <w:proofErr w:type="spellStart"/>
             <w:r>
@@ -3249,7 +3572,23 @@
                 <w:b/>
                 <w:bCs/>
               </w:rPr>
-              <w:t xml:space="preserve">: server </w:t>
+              <w:t xml:space="preserve">: </w:t>
+            </w:r>
+            <w:proofErr w:type="gramStart"/>
+            <w:r>
+              <w:rPr>
+                <w:b/>
+                <w:bCs/>
+              </w:rPr>
+              <w:t>server</w:t>
+            </w:r>
+            <w:proofErr w:type="gramEnd"/>
+            <w:r>
+              <w:rPr>
+                <w:b/>
+                <w:bCs/>
+              </w:rPr>
+              <w:t xml:space="preserve"> </w:t>
             </w:r>
             <w:proofErr w:type="spellStart"/>
             <w:r>
@@ -3270,7 +3609,23 @@
           </w:p>
           <w:p>
             <w:r>
-              <w:t xml:space="preserve">Requisito para que funcione el botón derecho PHP server: server </w:t>
+              <w:t xml:space="preserve">Requisito para que funcione el botón derecho PHP </w:t>
+            </w:r>
+            <w:proofErr w:type="gramStart"/>
+            <w:r>
+              <w:t>server</w:t>
+            </w:r>
+            <w:proofErr w:type="gramEnd"/>
+            <w:r>
+              <w:t xml:space="preserve">: </w:t>
+            </w:r>
+            <w:proofErr w:type="gramStart"/>
+            <w:r>
+              <w:t>server</w:t>
+            </w:r>
+            <w:proofErr w:type="gramEnd"/>
+            <w:r>
+              <w:t xml:space="preserve"> </w:t>
             </w:r>
             <w:proofErr w:type="spellStart"/>
             <w:r>
@@ -3590,7 +3945,15 @@
       </w:r>
       <w:proofErr w:type="spellEnd"/>
       <w:r>
-        <w:t xml:space="preserve">, sea con servidor creado por PHP server, servidor de XAMPP o servidor en contenedor, se </w:t>
+        <w:t xml:space="preserve">, sea con servidor creado por PHP </w:t>
+      </w:r>
+      <w:proofErr w:type="gramStart"/>
+      <w:r>
+        <w:t>server</w:t>
+      </w:r>
+      <w:proofErr w:type="gramEnd"/>
+      <w:r>
+        <w:t xml:space="preserve">, servidor de XAMPP o servidor en contenedor, se </w:t>
       </w:r>
       <w:proofErr w:type="spellStart"/>
       <w:r>
@@ -3670,15 +4033,13 @@
       </w:r>
       <w:proofErr w:type="spellEnd"/>
       <w:r>
-        <w:t xml:space="preserve">, VSC crea el servidor </w:t>
-      </w:r>
-      <w:proofErr w:type="spellStart"/>
-      <w:r>
-        <w:t>embabido</w:t>
-      </w:r>
-      <w:proofErr w:type="spellEnd"/>
-      <w:r>
-        <w:t xml:space="preserve"> de </w:t>
+        <w:t>, VSC crea el servidor emb</w:t>
+      </w:r>
+      <w:r>
+        <w:t>e</w:t>
+      </w:r>
+      <w:r>
+        <w:t xml:space="preserve">bido de </w:t>
       </w:r>
       <w:proofErr w:type="spellStart"/>
       <w:r>
@@ -3694,7 +4055,21 @@
       </w:r>
       <w:proofErr w:type="spellEnd"/>
       <w:r>
-        <w:t xml:space="preserve"> comprobado porque si cambio el nombre a la carpeta deja de funcionar, sin embargo si cambio el puerto 9003 del pho.ini, no deja de funcionar, y tiene que ser que por defecto xdebug.dll si no se le especifica puerto usara el 9003.</w:t>
+        <w:t xml:space="preserve"> comprobado porque si cambio el nombre a la carpeta deja de funcionar, sin </w:t>
+      </w:r>
+      <w:proofErr w:type="gramStart"/>
+      <w:r>
+        <w:t>embargo</w:t>
+      </w:r>
+      <w:proofErr w:type="gramEnd"/>
+      <w:r>
+        <w:t xml:space="preserve"> si cambio el puerto 9003 del ph</w:t>
+      </w:r>
+      <w:r>
+        <w:t>p</w:t>
+      </w:r>
+      <w:r>
+        <w:t>.ini, no deja de funcionar, y tiene que ser que por defecto xdebug.dll si no se le especifica puerto usara el 9003.</w:t>
       </w:r>
     </w:p>
     <w:p>
@@ -3954,7 +4329,23 @@
           <w:b/>
           <w:bCs/>
         </w:rPr>
-        <w:t xml:space="preserve"> que están en el mismo pc, XAMP es un servidor web pero ejecutado con un php.exe que </w:t>
+        <w:t xml:space="preserve"> que están en el mismo pc, XAMP es un servidor </w:t>
+      </w:r>
+      <w:proofErr w:type="gramStart"/>
+      <w:r>
+        <w:rPr>
+          <w:b/>
+          <w:bCs/>
+        </w:rPr>
+        <w:t>web</w:t>
+      </w:r>
+      <w:proofErr w:type="gramEnd"/>
+      <w:r>
+        <w:rPr>
+          <w:b/>
+          <w:bCs/>
+        </w:rPr>
+        <w:t xml:space="preserve"> pero ejecutado con un php.exe que </w:t>
       </w:r>
       <w:r>
         <w:rPr>
@@ -3978,22 +4369,124 @@
     </w:p>
     <w:p>
       <w:r>
+        <w:lastRenderedPageBreak/>
+        <w:t xml:space="preserve">EN LAS INSTRUCCIONES DE PHP DEBUG (PD) HAY UN </w:t>
+      </w:r>
+      <w:proofErr w:type="gramStart"/>
+      <w:r>
+        <w:t>LINK</w:t>
+      </w:r>
+      <w:proofErr w:type="gramEnd"/>
+      <w:r>
+        <w:t xml:space="preserve"> PARA USAR UN </w:t>
+      </w:r>
+      <w:r>
+        <w:rPr>
+          <w:b/>
+          <w:bCs/>
+        </w:rPr>
+        <w:t>ASISTENTE</w:t>
+      </w:r>
+      <w:r>
+        <w:t xml:space="preserve"> QUE DICE QUE TIENES QUE HACER, PINCHAR EN EL </w:t>
+      </w:r>
+      <w:proofErr w:type="gramStart"/>
+      <w:r>
+        <w:t>LINK</w:t>
+      </w:r>
+      <w:proofErr w:type="gramEnd"/>
+      <w:r>
+        <w:t xml:space="preserve"> Y SALE UNA VENTANA COMO ESTA</w:t>
+      </w:r>
+    </w:p>
+    <w:p/>
+    <w:p/>
+    <w:p>
+      <w:r>
+        <w:t xml:space="preserve">EN ESA VENTANA PEGAR EL TEXTO (CTRL+A) QUE TE DA LA FUNCION </w:t>
+      </w:r>
+      <w:r>
+        <w:rPr>
+          <w:b/>
+          <w:bCs/>
+        </w:rPr>
+        <w:t>PHPINFO()</w:t>
+      </w:r>
+      <w:r>
+        <w:t xml:space="preserve"> EJECUTADA EN UN FICHERO PHP EN EL SERVIDOR DE PHP (CARPETA CONECTADA CON XAMPP) O ESTO EN EL NAVEGADOR </w:t>
+      </w:r>
+      <w:hyperlink r:id="rId15" w:history="1">
+        <w:r>
+          <w:rPr>
+            <w:rStyle w:val="Hipervnculo"/>
+          </w:rPr>
+          <w:t>http://localhost/dashboard/phpinfo.php</w:t>
+        </w:r>
+      </w:hyperlink>
+    </w:p>
+    <w:p>
+      <w:pPr>
+        <w:rPr>
+          <w:b/>
+          <w:bCs/>
+        </w:rPr>
+      </w:pPr>
+      <w:r>
+        <w:rPr>
+          <w:b/>
+          <w:bCs/>
+        </w:rPr>
+        <w:t>EN LAS INSTRUCCIONES TE DICE QUE DESCARGUES UNA DLL, HAY QUE DESCARGAR ESA EXACTAMENTE, YO H ESTADO 3 DIAS CON FA</w:t>
+      </w:r>
+      <w:r>
+        <w:rPr>
+          <w:b/>
+          <w:bCs/>
+        </w:rPr>
+        <w:t>L</w:t>
+      </w:r>
+      <w:r>
+        <w:rPr>
+          <w:b/>
+          <w:bCs/>
+        </w:rPr>
+        <w:t>LOS Y ES PORQUE DESCARGUE OTRA.</w:t>
+      </w:r>
+    </w:p>
+    <w:p>
+      <w:r>
+        <w:t xml:space="preserve">SE DESCARGA, SE </w:t>
+      </w:r>
+      <w:r>
+        <w:t>RENOMBRA, SE</w:t>
+      </w:r>
+      <w:r>
+        <w:t xml:space="preserve"> COPIA EN EL DIRECTORIO QUE DICE Y LUEGO EDITAR PHP.INI ESCRIBIENDO ESTO:</w:t>
+      </w:r>
+    </w:p>
+    <w:p>
+      <w:pPr>
+        <w:rPr>
+          <w:lang w:val="de-DE"/>
+        </w:rPr>
+      </w:pPr>
+      <w:r>
         <w:rPr>
           <w:noProof/>
         </w:rPr>
         <w:drawing>
-          <wp:anchor distT="0" distB="0" distL="114300" distR="114300" simplePos="0" relativeHeight="251661312" behindDoc="0" locked="0" layoutInCell="1" allowOverlap="1" wp14:anchorId="3A3248D4" wp14:editId="40F7CBE7">
+          <wp:anchor distT="0" distB="0" distL="114300" distR="114300" simplePos="0" relativeHeight="251669504" behindDoc="0" locked="0" layoutInCell="1" allowOverlap="1" wp14:anchorId="449B5DE0" wp14:editId="3A36EA44">
             <wp:simplePos x="0" y="0"/>
             <wp:positionH relativeFrom="column">
-              <wp:posOffset>3276600</wp:posOffset>
+              <wp:posOffset>3352800</wp:posOffset>
             </wp:positionH>
             <wp:positionV relativeFrom="paragraph">
-              <wp:posOffset>459105</wp:posOffset>
+              <wp:posOffset>278130</wp:posOffset>
             </wp:positionV>
-            <wp:extent cx="3334385" cy="3629025"/>
-            <wp:effectExtent l="0" t="0" r="0" b="9525"/>
+            <wp:extent cx="3171825" cy="342900"/>
+            <wp:effectExtent l="0" t="0" r="0" b="0"/>
             <wp:wrapNone/>
-            <wp:docPr id="1335279555" name="Imagen 1" descr="Interfaz de usuario gráfica, Texto"/>
+            <wp:docPr id="1241287606" name="Imagen 1"/>
             <wp:cNvGraphicFramePr>
               <a:graphicFrameLocks xmlns:a="http://schemas.openxmlformats.org/drawingml/2006/main" noChangeAspect="1"/>
             </wp:cNvGraphicFramePr>
@@ -4001,249 +4494,7 @@
               <a:graphicData uri="http://schemas.openxmlformats.org/drawingml/2006/picture">
                 <pic:pic xmlns:pic="http://schemas.openxmlformats.org/drawingml/2006/picture">
                   <pic:nvPicPr>
-                    <pic:cNvPr id="1335279555" name="Imagen 1" descr="Interfaz de usuario gráfica, Texto"/>
-                    <pic:cNvPicPr/>
-                  </pic:nvPicPr>
-                  <pic:blipFill>
-                    <a:blip r:embed="rId15"/>
-                    <a:stretch>
-                      <a:fillRect/>
-                    </a:stretch>
-                  </pic:blipFill>
-                  <pic:spPr>
-                    <a:xfrm>
-                      <a:off x="0" y="0"/>
-                      <a:ext cx="3334385" cy="3629025"/>
-                    </a:xfrm>
-                    <a:prstGeom prst="rect">
-                      <a:avLst/>
-                    </a:prstGeom>
-                  </pic:spPr>
-                </pic:pic>
-              </a:graphicData>
-            </a:graphic>
-            <wp14:sizeRelH relativeFrom="margin">
-              <wp14:pctWidth>0</wp14:pctWidth>
-            </wp14:sizeRelH>
-            <wp14:sizeRelV relativeFrom="margin">
-              <wp14:pctHeight>0</wp14:pctHeight>
-            </wp14:sizeRelV>
-          </wp:anchor>
-        </w:drawing>
-      </w:r>
-      <w:r>
-        <w:rPr>
-          <w:noProof/>
-        </w:rPr>
-        <mc:AlternateContent>
-          <mc:Choice Requires="wps">
-            <w:drawing>
-              <wp:anchor distT="0" distB="0" distL="114300" distR="114300" simplePos="0" relativeHeight="251663360" behindDoc="0" locked="0" layoutInCell="1" allowOverlap="1" wp14:anchorId="206FEF26" wp14:editId="20563715">
-                <wp:simplePos x="0" y="0"/>
-                <wp:positionH relativeFrom="column">
-                  <wp:posOffset>3276600</wp:posOffset>
-                </wp:positionH>
-                <wp:positionV relativeFrom="paragraph">
-                  <wp:posOffset>3907155</wp:posOffset>
-                </wp:positionV>
-                <wp:extent cx="3334385" cy="635"/>
-                <wp:effectExtent l="0" t="0" r="0" b="0"/>
-                <wp:wrapNone/>
-                <wp:docPr id="164825865" name="Cuadro de texto 1"/>
-                <wp:cNvGraphicFramePr/>
-                <a:graphic xmlns:a="http://schemas.openxmlformats.org/drawingml/2006/main">
-                  <a:graphicData uri="http://schemas.microsoft.com/office/word/2010/wordprocessingShape">
-                    <wps:wsp>
-                      <wps:cNvSpPr txBox="1"/>
-                      <wps:spPr>
-                        <a:xfrm>
-                          <a:off x="0" y="0"/>
-                          <a:ext cx="3334385" cy="635"/>
-                        </a:xfrm>
-                        <a:prstGeom prst="rect">
-                          <a:avLst/>
-                        </a:prstGeom>
-                        <a:solidFill>
-                          <a:prstClr val="white"/>
-                        </a:solidFill>
-                        <a:ln>
-                          <a:noFill/>
-                        </a:ln>
-                      </wps:spPr>
-                      <wps:txbx>
-                        <w:txbxContent>
-                          <w:p>
-                            <w:pPr>
-                              <w:pStyle w:val="Descripcin"/>
-                              <w:rPr>
-                                <w:sz w:val="22"/>
-                                <w:szCs w:val="22"/>
-                              </w:rPr>
-                            </w:pPr>
-                            <w:r>
-                              <w:t>PHP INFO</w:t>
-                            </w:r>
-                          </w:p>
-                        </w:txbxContent>
-                      </wps:txbx>
-                      <wps:bodyPr rot="0" spcFirstLastPara="0" vertOverflow="overflow" horzOverflow="overflow" vert="horz" wrap="square" lIns="0" tIns="0" rIns="0" bIns="0" numCol="1" spcCol="0" rtlCol="0" fromWordArt="0" anchor="t" anchorCtr="0" forceAA="0" compatLnSpc="1">
-                        <a:prstTxWarp prst="textNoShape">
-                          <a:avLst/>
-                        </a:prstTxWarp>
-                        <a:spAutoFit/>
-                      </wps:bodyPr>
-                    </wps:wsp>
-                  </a:graphicData>
-                </a:graphic>
-              </wp:anchor>
-            </w:drawing>
-          </mc:Choice>
-          <mc:Fallback>
-            <w:pict>
-              <v:shapetype w14:anchorId="206FEF26" id="_x0000_t202" coordsize="21600,21600" o:spt="202" path="m,l,21600r21600,l21600,xe">
-                <v:stroke joinstyle="miter"/>
-                <v:path gradientshapeok="t" o:connecttype="rect"/>
-              </v:shapetype>
-              <v:shape id="Cuadro de texto 1" o:spid="_x0000_s1026" type="#_x0000_t202" style="position:absolute;margin-left:258pt;margin-top:307.65pt;width:262.55pt;height:.05pt;z-index:251663360;visibility:visible;mso-wrap-style:square;mso-wrap-distance-left:9pt;mso-wrap-distance-top:0;mso-wrap-distance-right:9pt;mso-wrap-distance-bottom:0;mso-position-horizontal:absolute;mso-position-horizontal-relative:text;mso-position-vertical:absolute;mso-position-vertical-relative:text;v-text-anchor:top" o:gfxdata="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" stroked="f">
-                <v:textbox style="mso-fit-shape-to-text:t" inset="0,0,0,0">
-                  <w:txbxContent>
-                    <w:p>
-                      <w:pPr>
-                        <w:pStyle w:val="Descripcin"/>
-                        <w:rPr>
-                          <w:sz w:val="22"/>
-                          <w:szCs w:val="22"/>
-                        </w:rPr>
-                      </w:pPr>
-                      <w:r>
-                        <w:t>PHP INFO</w:t>
-                      </w:r>
-                    </w:p>
-                  </w:txbxContent>
-                </v:textbox>
-              </v:shape>
-            </w:pict>
-          </mc:Fallback>
-        </mc:AlternateContent>
-      </w:r>
-      <w:r>
-        <w:rPr>
-          <w:noProof/>
-        </w:rPr>
-        <mc:AlternateContent>
-          <mc:Choice Requires="wps">
-            <w:drawing>
-              <wp:anchor distT="0" distB="0" distL="114300" distR="114300" simplePos="0" relativeHeight="251665408" behindDoc="0" locked="0" layoutInCell="1" allowOverlap="1" wp14:anchorId="7EAE5B51" wp14:editId="51F2EAE4">
-                <wp:simplePos x="0" y="0"/>
-                <wp:positionH relativeFrom="column">
-                  <wp:posOffset>-38100</wp:posOffset>
-                </wp:positionH>
-                <wp:positionV relativeFrom="paragraph">
-                  <wp:posOffset>4021455</wp:posOffset>
-                </wp:positionV>
-                <wp:extent cx="2910205" cy="635"/>
-                <wp:effectExtent l="0" t="0" r="0" b="0"/>
-                <wp:wrapNone/>
-                <wp:docPr id="1483309247" name="Cuadro de texto 1"/>
-                <wp:cNvGraphicFramePr/>
-                <a:graphic xmlns:a="http://schemas.openxmlformats.org/drawingml/2006/main">
-                  <a:graphicData uri="http://schemas.microsoft.com/office/word/2010/wordprocessingShape">
-                    <wps:wsp>
-                      <wps:cNvSpPr txBox="1"/>
-                      <wps:spPr>
-                        <a:xfrm>
-                          <a:off x="0" y="0"/>
-                          <a:ext cx="2910205" cy="635"/>
-                        </a:xfrm>
-                        <a:prstGeom prst="rect">
-                          <a:avLst/>
-                        </a:prstGeom>
-                        <a:solidFill>
-                          <a:prstClr val="white"/>
-                        </a:solidFill>
-                        <a:ln>
-                          <a:noFill/>
-                        </a:ln>
-                      </wps:spPr>
-                      <wps:txbx>
-                        <w:txbxContent>
-                          <w:p>
-                            <w:pPr>
-                              <w:pStyle w:val="Descripcin"/>
-                              <w:rPr>
-                                <w:noProof/>
-                                <w:sz w:val="22"/>
-                                <w:szCs w:val="22"/>
-                              </w:rPr>
-                            </w:pPr>
-                            <w:r>
-                              <w:t>ASISTENTE</w:t>
-                            </w:r>
-                          </w:p>
-                        </w:txbxContent>
-                      </wps:txbx>
-                      <wps:bodyPr rot="0" spcFirstLastPara="0" vertOverflow="overflow" horzOverflow="overflow" vert="horz" wrap="square" lIns="0" tIns="0" rIns="0" bIns="0" numCol="1" spcCol="0" rtlCol="0" fromWordArt="0" anchor="t" anchorCtr="0" forceAA="0" compatLnSpc="1">
-                        <a:prstTxWarp prst="textNoShape">
-                          <a:avLst/>
-                        </a:prstTxWarp>
-                        <a:spAutoFit/>
-                      </wps:bodyPr>
-                    </wps:wsp>
-                  </a:graphicData>
-                </a:graphic>
-              </wp:anchor>
-            </w:drawing>
-          </mc:Choice>
-          <mc:Fallback>
-            <w:pict>
-              <v:shape w14:anchorId="7EAE5B51" id="_x0000_s1027" type="#_x0000_t202" style="position:absolute;margin-left:-3pt;margin-top:316.65pt;width:229.15pt;height:.05pt;z-index:251665408;visibility:visible;mso-wrap-style:square;mso-wrap-distance-left:9pt;mso-wrap-distance-top:0;mso-wrap-distance-right:9pt;mso-wrap-distance-bottom:0;mso-position-horizontal:absolute;mso-position-horizontal-relative:text;mso-position-vertical:absolute;mso-position-vertical-relative:text;v-text-anchor:top" o:gfxdata="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" stroked="f">
-                <v:textbox style="mso-fit-shape-to-text:t" inset="0,0,0,0">
-                  <w:txbxContent>
-                    <w:p>
-                      <w:pPr>
-                        <w:pStyle w:val="Descripcin"/>
-                        <w:rPr>
-                          <w:noProof/>
-                          <w:sz w:val="22"/>
-                          <w:szCs w:val="22"/>
-                        </w:rPr>
-                      </w:pPr>
-                      <w:r>
-                        <w:t>ASISTENTE</w:t>
-                      </w:r>
-                    </w:p>
-                  </w:txbxContent>
-                </v:textbox>
-              </v:shape>
-            </w:pict>
-          </mc:Fallback>
-        </mc:AlternateContent>
-      </w:r>
-      <w:r>
-        <w:rPr>
-          <w:noProof/>
-        </w:rPr>
-        <w:drawing>
-          <wp:anchor distT="0" distB="0" distL="114300" distR="114300" simplePos="0" relativeHeight="251659264" behindDoc="0" locked="0" layoutInCell="1" allowOverlap="1" wp14:anchorId="21EE5EE5" wp14:editId="5E438AB7">
-            <wp:simplePos x="0" y="0"/>
-            <wp:positionH relativeFrom="column">
-              <wp:posOffset>-38100</wp:posOffset>
-            </wp:positionH>
-            <wp:positionV relativeFrom="paragraph">
-              <wp:posOffset>411480</wp:posOffset>
-            </wp:positionV>
-            <wp:extent cx="2910219" cy="3552825"/>
-            <wp:effectExtent l="0" t="0" r="4445" b="0"/>
-            <wp:wrapNone/>
-            <wp:docPr id="249694419" name="Imagen 1" descr="Interfaz de usuario gráfica, Aplicación&#10;&#10;El contenido generado por IA puede ser incorrecto."/>
-            <wp:cNvGraphicFramePr>
-              <a:graphicFrameLocks xmlns:a="http://schemas.openxmlformats.org/drawingml/2006/main" noChangeAspect="1"/>
-            </wp:cNvGraphicFramePr>
-            <a:graphic xmlns:a="http://schemas.openxmlformats.org/drawingml/2006/main">
-              <a:graphicData uri="http://schemas.openxmlformats.org/drawingml/2006/picture">
-                <pic:pic xmlns:pic="http://schemas.openxmlformats.org/drawingml/2006/picture">
-                  <pic:nvPicPr>
-                    <pic:cNvPr id="249694419" name="Imagen 1" descr="Interfaz de usuario gráfica, Aplicación&#10;&#10;El contenido generado por IA puede ser incorrecto."/>
+                    <pic:cNvPr id="1241287606" name=""/>
                     <pic:cNvPicPr/>
                   </pic:nvPicPr>
                   <pic:blipFill>
@@ -4255,7 +4506,7 @@
                   <pic:spPr>
                     <a:xfrm>
                       <a:off x="0" y="0"/>
-                      <a:ext cx="2912618" cy="3555754"/>
+                      <a:ext cx="3171825" cy="342900"/>
                     </a:xfrm>
                     <a:prstGeom prst="rect">
                       <a:avLst/>
@@ -4264,92 +4515,27 @@
                 </pic:pic>
               </a:graphicData>
             </a:graphic>
-            <wp14:sizeRelH relativeFrom="margin">
-              <wp14:pctWidth>0</wp14:pctWidth>
-            </wp14:sizeRelH>
-            <wp14:sizeRelV relativeFrom="margin">
-              <wp14:pctHeight>0</wp14:pctHeight>
-            </wp14:sizeRelV>
           </wp:anchor>
         </w:drawing>
       </w:r>
       <w:r>
-        <w:t xml:space="preserve">EN LAS INSTRUCCIONES DE PHP DEBUG (PD) HAY UN LINK PARA USAR UN </w:t>
-      </w:r>
-      <w:r>
-        <w:rPr>
-          <w:b/>
-          <w:bCs/>
-        </w:rPr>
-        <w:t>ASISTENTE</w:t>
-      </w:r>
-      <w:r>
-        <w:t xml:space="preserve"> QUE DICE QUE TIENES QUE HACER, PINCHAR EN EL LINK Y SALE UNA VENTANA COMO ESTA</w:t>
-      </w:r>
-    </w:p>
-    <w:p/>
-    <w:p/>
-    <w:p>
-      <w:r>
-        <w:t xml:space="preserve">EN ESA VENTANA PEGAR EL TEXTO (CTRL+A) QUE TE DA LA FUNCION </w:t>
-      </w:r>
-      <w:r>
-        <w:rPr>
-          <w:b/>
-          <w:bCs/>
-        </w:rPr>
-        <w:t>PHPINFO()</w:t>
-      </w:r>
-      <w:r>
-        <w:t xml:space="preserve"> EJECUTADA EN UN FICHERO PHP EN EL SERVIDOR DE PHP (CARPETA CONECTADA CON XAMPP) O ESTO EN EL NAVEGADOR </w:t>
-      </w:r>
-      <w:hyperlink r:id="rId17" w:history="1">
-        <w:r>
-          <w:rPr>
-            <w:rStyle w:val="Hipervnculo"/>
-          </w:rPr>
-          <w:t>http://localhost/dashboard/phpinfo.php</w:t>
-        </w:r>
-      </w:hyperlink>
+        <w:rPr>
+          <w:lang w:val="de-DE"/>
+        </w:rPr>
+        <w:t>zend_extension = xdebug</w:t>
+      </w:r>
     </w:p>
     <w:p>
       <w:pPr>
         <w:rPr>
-          <w:b/>
-          <w:bCs/>
+          <w:lang w:val="de-DE"/>
         </w:rPr>
       </w:pPr>
       <w:r>
         <w:rPr>
-          <w:b/>
-          <w:bCs/>
-        </w:rPr>
-        <w:t>EN LAS INSTRUCCIONES TE DICE QUE DESCARGUES UNA DLL, HAY QUE DESCARGAR ESA EXACTAMENTE, YO H ESTADO 3 DIAS CON FA</w:t>
-      </w:r>
-      <w:r>
-        <w:rPr>
-          <w:b/>
-          <w:bCs/>
-        </w:rPr>
-        <w:t>L</w:t>
-      </w:r>
-      <w:r>
-        <w:rPr>
-          <w:b/>
-          <w:bCs/>
-        </w:rPr>
-        <w:t>LOS Y ES PORQUE DESCARGUE OTRA.</w:t>
-      </w:r>
-    </w:p>
-    <w:p>
-      <w:r>
-        <w:t xml:space="preserve">SE DESCARGA, SE </w:t>
-      </w:r>
-      <w:r>
-        <w:t>RENOMBRA, SE</w:t>
-      </w:r>
-      <w:r>
-        <w:t xml:space="preserve"> COPIA EN EL DIRECTORIO QUE DICE Y LUEGO EDITAR PHP.INI ESCRIBIENDO ESTO:</w:t>
+          <w:lang w:val="de-DE"/>
+        </w:rPr>
+        <w:t>xdebug.mode = debug</w:t>
       </w:r>
     </w:p>
     <w:p>
@@ -4362,7 +4548,7 @@
         <w:rPr>
           <w:lang w:val="de-DE"/>
         </w:rPr>
-        <w:t>zend_extension = xdebug</w:t>
+        <w:t>xdebug.start_with_request=yes</w:t>
       </w:r>
     </w:p>
     <w:p>
@@ -4375,43 +4561,7 @@
         <w:rPr>
           <w:lang w:val="de-DE"/>
         </w:rPr>
-        <w:t>xdebug.mode = debug</w:t>
-      </w:r>
-    </w:p>
-    <w:p>
-      <w:pPr>
-        <w:rPr>
-          <w:lang w:val="de-DE"/>
-        </w:rPr>
-      </w:pPr>
-      <w:r>
-        <w:rPr>
-          <w:lang w:val="de-DE"/>
-        </w:rPr>
-        <w:t>xdebug.start_with_request = yes</w:t>
-      </w:r>
-    </w:p>
-    <w:p>
-      <w:pPr>
-        <w:rPr>
-          <w:lang w:val="de-DE"/>
-        </w:rPr>
-      </w:pPr>
-      <w:r>
-        <w:rPr>
-          <w:lang w:val="de-DE"/>
-        </w:rPr>
-        <w:t>xdebug.remote_port = 9003</w:t>
-      </w:r>
-    </w:p>
-    <w:p>
-      <w:proofErr w:type="spellStart"/>
-      <w:r>
-        <w:t>xdebug.idekey</w:t>
-      </w:r>
-      <w:proofErr w:type="spellEnd"/>
-      <w:r>
-        <w:t xml:space="preserve"> = VSCODE</w:t>
+        <w:t>xdebug.idekey=VSCODE</w:t>
       </w:r>
     </w:p>
     <w:p>
@@ -4432,7 +4582,7 @@
           <w:noProof/>
         </w:rPr>
         <w:drawing>
-          <wp:anchor distT="0" distB="0" distL="114300" distR="114300" simplePos="0" relativeHeight="251667456" behindDoc="0" locked="0" layoutInCell="1" allowOverlap="1" wp14:anchorId="08F922B2" wp14:editId="13822ACC">
+          <wp:anchor distT="0" distB="0" distL="114300" distR="114300" simplePos="0" relativeHeight="251667456" behindDoc="0" locked="0" layoutInCell="1" allowOverlap="1" wp14:anchorId="08F922B2" wp14:editId="5EBC1822">
             <wp:simplePos x="0" y="0"/>
             <wp:positionH relativeFrom="column">
               <wp:posOffset>6528435</wp:posOffset>
@@ -4455,7 +4605,7 @@
                     <pic:cNvPicPr/>
                   </pic:nvPicPr>
                   <pic:blipFill>
-                    <a:blip r:embed="rId18"/>
+                    <a:blip r:embed="rId17"/>
                     <a:stretch>
                       <a:fillRect/>
                     </a:stretch>
@@ -4482,54 +4632,6 @@
         </w:drawing>
       </w:r>
       <w:r>
-        <w:rPr>
-          <w:noProof/>
-        </w:rPr>
-        <w:drawing>
-          <wp:anchor distT="0" distB="0" distL="114300" distR="114300" simplePos="0" relativeHeight="251669504" behindDoc="0" locked="0" layoutInCell="1" allowOverlap="1" wp14:anchorId="449B5DE0" wp14:editId="0017560B">
-            <wp:simplePos x="0" y="0"/>
-            <wp:positionH relativeFrom="column">
-              <wp:posOffset>3933825</wp:posOffset>
-            </wp:positionH>
-            <wp:positionV relativeFrom="paragraph">
-              <wp:posOffset>469265</wp:posOffset>
-            </wp:positionV>
-            <wp:extent cx="3172268" cy="342948"/>
-            <wp:effectExtent l="0" t="0" r="0" b="0"/>
-            <wp:wrapNone/>
-            <wp:docPr id="1241287606" name="Imagen 1"/>
-            <wp:cNvGraphicFramePr>
-              <a:graphicFrameLocks xmlns:a="http://schemas.openxmlformats.org/drawingml/2006/main" noChangeAspect="1"/>
-            </wp:cNvGraphicFramePr>
-            <a:graphic xmlns:a="http://schemas.openxmlformats.org/drawingml/2006/main">
-              <a:graphicData uri="http://schemas.openxmlformats.org/drawingml/2006/picture">
-                <pic:pic xmlns:pic="http://schemas.openxmlformats.org/drawingml/2006/picture">
-                  <pic:nvPicPr>
-                    <pic:cNvPr id="1241287606" name=""/>
-                    <pic:cNvPicPr/>
-                  </pic:nvPicPr>
-                  <pic:blipFill>
-                    <a:blip r:embed="rId19"/>
-                    <a:stretch>
-                      <a:fillRect/>
-                    </a:stretch>
-                  </pic:blipFill>
-                  <pic:spPr>
-                    <a:xfrm>
-                      <a:off x="0" y="0"/>
-                      <a:ext cx="3172268" cy="342948"/>
-                    </a:xfrm>
-                    <a:prstGeom prst="rect">
-                      <a:avLst/>
-                    </a:prstGeom>
-                  </pic:spPr>
-                </pic:pic>
-              </a:graphicData>
-            </a:graphic>
-          </wp:anchor>
-        </w:drawing>
-      </w:r>
-      <w:r>
         <w:t>LUEGO VAMOS A ESTE BOTON</w:t>
       </w:r>
       <w:r>
@@ -4585,9 +4687,104 @@
     </w:p>
     <w:p>
       <w:r>
-        <w:t>PONER EL PUESTO 9003 MISMO QUE EL PHP.INI</w:t>
-      </w:r>
-    </w:p>
+        <w:t xml:space="preserve">PONER </w:t>
+      </w:r>
+    </w:p>
+    <w:p>
+      <w:r>
+        <w:t>{</w:t>
+      </w:r>
+    </w:p>
+    <w:p>
+      <w:r>
+        <w:t>            "</w:t>
+      </w:r>
+      <w:proofErr w:type="spellStart"/>
+      <w:r>
+        <w:t>name</w:t>
+      </w:r>
+      <w:proofErr w:type="spellEnd"/>
+      <w:r>
+        <w:t xml:space="preserve">": "Listen </w:t>
+      </w:r>
+      <w:proofErr w:type="spellStart"/>
+      <w:r>
+        <w:t>for</w:t>
+      </w:r>
+      <w:proofErr w:type="spellEnd"/>
+      <w:r>
+        <w:t xml:space="preserve"> </w:t>
+      </w:r>
+      <w:proofErr w:type="spellStart"/>
+      <w:r>
+        <w:t>Xdebug</w:t>
+      </w:r>
+      <w:proofErr w:type="spellEnd"/>
+      <w:r>
+        <w:t>",</w:t>
+      </w:r>
+    </w:p>
+    <w:p>
+      <w:r>
+        <w:t>            "</w:t>
+      </w:r>
+      <w:proofErr w:type="spellStart"/>
+      <w:r>
+        <w:t>type</w:t>
+      </w:r>
+      <w:proofErr w:type="spellEnd"/>
+      <w:r>
+        <w:t>": "</w:t>
+      </w:r>
+      <w:proofErr w:type="spellStart"/>
+      <w:r>
+        <w:t>php</w:t>
+      </w:r>
+      <w:proofErr w:type="spellEnd"/>
+      <w:r>
+        <w:t>",</w:t>
+      </w:r>
+    </w:p>
+    <w:p>
+      <w:r>
+        <w:t>            "</w:t>
+      </w:r>
+      <w:proofErr w:type="spellStart"/>
+      <w:r>
+        <w:t>request</w:t>
+      </w:r>
+      <w:proofErr w:type="spellEnd"/>
+      <w:r>
+        <w:t>": "</w:t>
+      </w:r>
+      <w:proofErr w:type="spellStart"/>
+      <w:r>
+        <w:t>launch</w:t>
+      </w:r>
+      <w:proofErr w:type="spellEnd"/>
+      <w:r>
+        <w:t>",</w:t>
+      </w:r>
+    </w:p>
+    <w:p>
+      <w:r>
+        <w:t>            "</w:t>
+      </w:r>
+      <w:proofErr w:type="spellStart"/>
+      <w:r>
+        <w:t>port</w:t>
+      </w:r>
+      <w:proofErr w:type="spellEnd"/>
+      <w:r>
+        <w:t>": 9003</w:t>
+      </w:r>
+    </w:p>
+    <w:p>
+      <w:r>
+        <w:t>        }</w:t>
+      </w:r>
+    </w:p>
+    <w:p/>
     <w:p>
       <w:r>
         <w:rPr>
@@ -4617,7 +4814,7 @@
                     <pic:cNvPicPr/>
                   </pic:nvPicPr>
                   <pic:blipFill>
-                    <a:blip r:embed="rId20"/>
+                    <a:blip r:embed="rId18"/>
                     <a:stretch>
                       <a:fillRect/>
                     </a:stretch>
@@ -4715,7 +4912,21 @@
           <w:b/>
           <w:bCs/>
         </w:rPr>
-        <w:t xml:space="preserve"> LOS VALORES DE LAS VARIABLES EN EL DEGUG HAY QUE HACER PHP SERVER PROYEC CON EL BOTON DERECHO </w:t>
+        <w:t xml:space="preserve"> LOS VALORES DE LAS VARIABLES EN EL DE</w:t>
+      </w:r>
+      <w:r>
+        <w:rPr>
+          <w:b/>
+          <w:bCs/>
+        </w:rPr>
+        <w:t>B</w:t>
+      </w:r>
+      <w:r>
+        <w:rPr>
+          <w:b/>
+          <w:bCs/>
+        </w:rPr>
+        <w:t xml:space="preserve">UG HAY QUE HACER PHP SERVER PROYEC CON EL BOTON DERECHO </w:t>
       </w:r>
       <w:r>
         <w:rPr>
@@ -4752,7 +4963,7 @@
         </w:rPr>
         <w:t xml:space="preserve">el script en </w:t>
       </w:r>
-      <w:hyperlink r:id="rId21" w:history="1">
+      <w:hyperlink r:id="rId19" w:history="1">
         <w:r>
           <w:rPr>
             <w:rStyle w:val="Hipervnculo"/>
@@ -4785,7 +4996,7 @@
         </w:rPr>
         <w:t xml:space="preserve"> o poner en el navegador </w:t>
       </w:r>
-      <w:hyperlink r:id="rId22" w:history="1">
+      <w:hyperlink r:id="rId20" w:history="1">
         <w:r>
           <w:rPr>
             <w:rStyle w:val="Hipervnculo"/>
@@ -4894,7 +5105,23 @@
           <w:b/>
           <w:bCs/>
         </w:rPr>
-        <w:t xml:space="preserve"> (La extensión PHP server se ha configurado para que ejecute el php.exe de </w:t>
+        <w:t xml:space="preserve"> (La extensión PHP </w:t>
+      </w:r>
+      <w:proofErr w:type="gramStart"/>
+      <w:r>
+        <w:rPr>
+          <w:b/>
+          <w:bCs/>
+        </w:rPr>
+        <w:t>server</w:t>
+      </w:r>
+      <w:proofErr w:type="gramEnd"/>
+      <w:r>
+        <w:rPr>
+          <w:b/>
+          <w:bCs/>
+        </w:rPr>
+        <w:t xml:space="preserve"> se ha configurado para que ejecute el php.exe de </w:t>
       </w:r>
       <w:proofErr w:type="spellStart"/>
       <w:r>
@@ -4945,7 +5172,25 @@
           <w:bCs/>
           <w:u w:val="single"/>
         </w:rPr>
-        <w:t xml:space="preserve"> con XAMPP o contenedor debo primero abrir el folder correspondiente a donde ejecuta los script XAMPP </w:t>
+        <w:t xml:space="preserve"> con XAMPP o contenedor debo primero abrir el folder correspondiente a donde ejecuta </w:t>
+      </w:r>
+      <w:proofErr w:type="gramStart"/>
+      <w:r>
+        <w:rPr>
+          <w:b/>
+          <w:bCs/>
+          <w:u w:val="single"/>
+        </w:rPr>
+        <w:t>los script</w:t>
+      </w:r>
+      <w:proofErr w:type="gramEnd"/>
+      <w:r>
+        <w:rPr>
+          <w:b/>
+          <w:bCs/>
+          <w:u w:val="single"/>
+        </w:rPr>
+        <w:t xml:space="preserve"> XAMPP </w:t>
       </w:r>
       <w:r>
         <w:rPr>
@@ -5045,6 +5290,7 @@
           <w:bCs/>
           <w:u w:val="single"/>
         </w:rPr>
+        <w:lastRenderedPageBreak/>
         <w:t>XAMPP</w:t>
       </w:r>
     </w:p>
@@ -5127,7 +5373,11 @@
         <w:t>nombre script</w:t>
       </w:r>
       <w:r>
-        <w:t xml:space="preserve">. Si pongo solo </w:t>
+        <w:t xml:space="preserve">. Si pongo </w:t>
+      </w:r>
+      <w:proofErr w:type="gramStart"/>
+      <w:r>
+        <w:t xml:space="preserve">solo </w:t>
       </w:r>
       <w:r>
         <w:t xml:space="preserve"> </w:t>
@@ -5135,6 +5385,7 @@
       <w:r>
         <w:t>C:\xampp\htdocs</w:t>
       </w:r>
+      <w:proofErr w:type="gramEnd"/>
       <w:r>
         <w:t xml:space="preserve">  </w:t>
       </w:r>
@@ -5218,14 +5469,21 @@
     </w:p>
     <w:p>
       <w:r>
-        <w:lastRenderedPageBreak/>
         <w:t xml:space="preserve">Nota: en la </w:t>
       </w:r>
       <w:r>
         <w:t>página</w:t>
       </w:r>
       <w:r>
-        <w:t xml:space="preserve"> de bienvenida de X hay un link arriba que pone </w:t>
+        <w:t xml:space="preserve"> de bienvenida de X hay un </w:t>
+      </w:r>
+      <w:proofErr w:type="gramStart"/>
+      <w:r>
+        <w:t>link</w:t>
+      </w:r>
+      <w:proofErr w:type="gramEnd"/>
+      <w:r>
+        <w:t xml:space="preserve"> arriba que pone </w:t>
       </w:r>
       <w:proofErr w:type="spellStart"/>
       <w:r>
@@ -5272,7 +5530,15 @@
         <w:t>.</w:t>
       </w:r>
       <w:r>
-        <w:t xml:space="preserve"> también hay otro link </w:t>
+        <w:t xml:space="preserve"> también hay otro </w:t>
+      </w:r>
+      <w:proofErr w:type="gramStart"/>
+      <w:r>
+        <w:t>link</w:t>
+      </w:r>
+      <w:proofErr w:type="gramEnd"/>
+      <w:r>
+        <w:t xml:space="preserve"> </w:t>
       </w:r>
       <w:proofErr w:type="spellStart"/>
       <w:r>
@@ -5399,14 +5665,32 @@
           <w:bCs/>
           <w:u w:val="single"/>
         </w:rPr>
-        <w:t xml:space="preserve"> con XAMPP o contenedor debo primero abrir el folder correspondiente a donde ejecuta los script XAMPP </w:t>
-      </w:r>
+        <w:t xml:space="preserve"> con XAMPP o contenedor debo primero abrir el folder correspondiente a donde ejecuta </w:t>
+      </w:r>
+      <w:proofErr w:type="gramStart"/>
       <w:r>
         <w:rPr>
           <w:b/>
           <w:bCs/>
           <w:u w:val="single"/>
         </w:rPr>
+        <w:t>los script</w:t>
+      </w:r>
+      <w:proofErr w:type="gramEnd"/>
+      <w:r>
+        <w:rPr>
+          <w:b/>
+          <w:bCs/>
+          <w:u w:val="single"/>
+        </w:rPr>
+        <w:t xml:space="preserve"> XAMPP </w:t>
+      </w:r>
+      <w:r>
+        <w:rPr>
+          <w:b/>
+          <w:bCs/>
+          <w:u w:val="single"/>
+        </w:rPr>
         <w:t>(</w:t>
       </w:r>
       <w:r>
@@ -5485,10 +5769,15 @@
       </w:r>
     </w:p>
     <w:p>
-      <w:r>
-        <w:t xml:space="preserve">LINK DE INSTRUCCIONES: </w:t>
-      </w:r>
-      <w:hyperlink r:id="rId23" w:history="1">
+      <w:proofErr w:type="gramStart"/>
+      <w:r>
+        <w:t>LINK</w:t>
+      </w:r>
+      <w:proofErr w:type="gramEnd"/>
+      <w:r>
+        <w:t xml:space="preserve"> DE INSTRUCCIONES: </w:t>
+      </w:r>
+      <w:hyperlink r:id="rId21" w:history="1">
         <w:r>
           <w:rPr>
             <w:rStyle w:val="Hipervnculo"/>
@@ -5744,6 +6033,7 @@
     </w:p>
     <w:p>
       <w:r>
+        <w:lastRenderedPageBreak/>
         <w:t>También podemos ver que en esta imagen no crea un contenedor con apache ni ningún servidor web, es porque ya lo lleva integrado la image</w:t>
       </w:r>
       <w:r>
@@ -5892,7 +6182,15 @@
         <w:t> </w:t>
       </w:r>
       <w:r>
-        <w:t xml:space="preserve">Y tampoco se usara el </w:t>
+        <w:t xml:space="preserve">Y tampoco se </w:t>
+      </w:r>
+      <w:proofErr w:type="gramStart"/>
+      <w:r>
+        <w:t>usara</w:t>
+      </w:r>
+      <w:proofErr w:type="gramEnd"/>
+      <w:r>
+        <w:t xml:space="preserve"> el </w:t>
       </w:r>
       <w:proofErr w:type="spellStart"/>
       <w:r>
@@ -5900,7 +6198,15 @@
       </w:r>
       <w:proofErr w:type="spellEnd"/>
       <w:r>
-        <w:t>, con lo que aunque ejecute el script en el contenedor no vere variables.</w:t>
+        <w:t xml:space="preserve">, con lo </w:t>
+      </w:r>
+      <w:proofErr w:type="gramStart"/>
+      <w:r>
+        <w:t>que</w:t>
+      </w:r>
+      <w:proofErr w:type="gramEnd"/>
+      <w:r>
+        <w:t xml:space="preserve"> aunque ejecute el script en el contenedor no vere variables.</w:t>
       </w:r>
       <w:r>
         <w:t xml:space="preserve">       </w:t>
@@ -5918,7 +6224,6 @@
           <w:b/>
           <w:bCs/>
         </w:rPr>
-        <w:lastRenderedPageBreak/>
         <w:t xml:space="preserve">El depurador de PHP consiste en un </w:t>
       </w:r>
       <w:r>
@@ -6012,23 +6317,21 @@
           <w:b/>
           <w:bCs/>
         </w:rPr>
-        <w:t xml:space="preserve">pear, porque el script se copia en la carpeta local del XAMP para que lo </w:t>
-      </w:r>
-      <w:proofErr w:type="spellStart"/>
-      <w:r>
-        <w:rPr>
-          <w:b/>
-          <w:bCs/>
-        </w:rPr>
-        <w:t>carge</w:t>
-      </w:r>
-      <w:proofErr w:type="spellEnd"/>
-      <w:r>
-        <w:rPr>
-          <w:b/>
-          <w:bCs/>
-        </w:rPr>
-        <w:t xml:space="preserve"> en su servidor web y así ya se ven el script y php.exe</w:t>
+        <w:t>pear, porque el script se copia en la carpeta local del XAMP para que lo carg</w:t>
+      </w:r>
+      <w:r>
+        <w:rPr>
+          <w:b/>
+          <w:bCs/>
+        </w:rPr>
+        <w:t>u</w:t>
+      </w:r>
+      <w:r>
+        <w:rPr>
+          <w:b/>
+          <w:bCs/>
+        </w:rPr>
+        <w:t>e en su servidor web y así ya se ven el script y php.exe</w:t>
       </w:r>
       <w:r>
         <w:rPr>
@@ -6307,7 +6610,7 @@
       <w:r>
         <w:t xml:space="preserve"> se comunique con quien se comunique, hay que ejecutar el script en el servidor web del contenedor poniendo esto en el navegador </w:t>
       </w:r>
-      <w:hyperlink r:id="rId24" w:history="1">
+      <w:hyperlink r:id="rId22" w:history="1">
         <w:r>
           <w:rPr>
             <w:rStyle w:val="Hipervnculo"/>
@@ -6336,7 +6639,23 @@
       </w:r>
       <w:proofErr w:type="spellEnd"/>
       <w:r>
-        <w:t xml:space="preserve"> de VSC con el botón derecho y aunque lo ejecuta pero no carga variables en este paso, el PHP.exe del contenedor no es local y no es el mismo PHP que ejecuta PHP server que ejecuta el php.exe de XAMPP.</w:t>
+        <w:t xml:space="preserve"> de VSC con el botón derecho y aunque lo </w:t>
+      </w:r>
+      <w:proofErr w:type="gramStart"/>
+      <w:r>
+        <w:t>ejecuta</w:t>
+      </w:r>
+      <w:proofErr w:type="gramEnd"/>
+      <w:r>
+        <w:t xml:space="preserve"> pero no carga variables en este paso, el PHP.exe del contenedor no es local y no es el mismo PHP que ejecuta PHP </w:t>
+      </w:r>
+      <w:proofErr w:type="gramStart"/>
+      <w:r>
+        <w:t>server</w:t>
+      </w:r>
+      <w:proofErr w:type="gramEnd"/>
+      <w:r>
+        <w:t xml:space="preserve"> que ejecuta el php.exe de XAMPP.</w:t>
       </w:r>
     </w:p>
     <w:p/>
@@ -7573,7 +7892,6 @@
   <w:style w:type="character" w:default="1" w:styleId="Fuentedeprrafopredeter">
     <w:name w:val="Default Paragraph Font"/>
     <w:uiPriority w:val="1"/>
-    <w:semiHidden/>
     <w:unhideWhenUsed/>
   </w:style>
   <w:style w:type="table" w:default="1" w:styleId="Tablanormal">

</xml_diff>